<commit_message>
Refine CV per review: drop summary, verb-led projects, digits, distinctive interests
Co-Authored-By: Claude Opus 4.8 <noreply@anthropic.com>
</commit_message>
<xml_diff>
--- a/src/assests/documents/Daniel_Baylan_CV.docx
+++ b/src/assests/documents/Daniel_Baylan_CV.docx
@@ -26,7 +26,7 @@
       <w:r>
         <w:t xml:space="preserve">DanielJBaylan@gmail.com  |  +44 7703144054  |  </w:t>
       </w:r>
-      <w:hyperlink w:history="1" r:id="rIdxssfspqqxaxld00f2soej">
+      <w:hyperlink w:history="1" r:id="rIdkeoltmxez7b_nni1q3ayh">
         <w:r>
           <w:rPr>
             <w:rStyle w:val="Hyperlink"/>
@@ -37,7 +37,7 @@
       <w:r>
         <w:t xml:space="preserve">  |  </w:t>
       </w:r>
-      <w:hyperlink w:history="1" r:id="rIdtwttui2r1bjpcia3-dx4d">
+      <w:hyperlink w:history="1" r:id="rIdmmfg2rbzk_eykmztgdwqz">
         <w:r>
           <w:rPr>
             <w:rStyle w:val="Hyperlink"/>
@@ -45,19 +45,6 @@
           <w:t xml:space="preserve">Portfolio</w:t>
         </w:r>
       </w:hyperlink>
-    </w:p>
-    <w:p>
-      <w:pPr>
-        <w:spacing w:after="40"/>
-        <w:jc w:val="center"/>
-      </w:pPr>
-      <w:r>
-        <w:rPr>
-          <w:i/>
-          <w:iCs/>
-        </w:rPr>
-        <w:t xml:space="preserve">Third-year MEng Computer Science student (University of Birmingham, First-Class) building and leading engineering on a pre-launch multi-tenant SaaS platform, including a self-built AI-assisted development workflow with independent review gating. Seeking a 2027–28 Year in Industry placement in software engineering or cyber security.</w:t>
-      </w:r>
     </w:p>
     <w:p>
       <w:pPr>
@@ -179,7 +166,7 @@
         <w:spacing w:after="20"/>
       </w:pPr>
       <w:r>
-        <w:t xml:space="preserve">Average: 76.7% across Years 1 &amp; 2 (First-Class); on track for a First</w:t>
+        <w:t xml:space="preserve">Average Grade: 76.7% (First Class)</w:t>
       </w:r>
     </w:p>
     <w:p>
@@ -432,46 +419,46 @@
         <w:spacing w:after="20"/>
       </w:pPr>
       <w:r>
-        <w:t xml:space="preserve">Led end-to-end build of an AI-powered, multi-tenant document-collection SaaS (Next.js, React, TypeScript, Supabase/PostgreSQL), with three client firms confirmed and queued for onboarding ahead of launch</w:t>
-      </w:r>
-    </w:p>
-    <w:p>
-      <w:pPr>
-        <w:pStyle w:val="ListParagraph"/>
-        <w:numPr>
-          <w:ilvl w:val="0"/>
-          <w:numId w:val="1"/>
-        </w:numPr>
-        <w:spacing w:after="20"/>
-      </w:pPr>
-      <w:r>
-        <w:t xml:space="preserve">Designed and built an AI-assisted engineering workflow (Claude Code + Codex) that gates every AI-generated change behind an independent adversarial review before production, reducing feature delivery time by an estimated 60–90%</w:t>
-      </w:r>
-    </w:p>
-    <w:p>
-      <w:pPr>
-        <w:pStyle w:val="ListParagraph"/>
-        <w:numPr>
-          <w:ilvl w:val="0"/>
-          <w:numId w:val="1"/>
-        </w:numPr>
-        <w:spacing w:after="20"/>
-      </w:pPr>
-      <w:r>
-        <w:t xml:space="preserve">Architected the full stack: database schema, per-tenant row-level security, backend, front end, and an AI-driven document-verification pipeline</w:t>
-      </w:r>
-    </w:p>
-    <w:p>
-      <w:pPr>
-        <w:pStyle w:val="ListParagraph"/>
-        <w:numPr>
-          <w:ilvl w:val="0"/>
-          <w:numId w:val="1"/>
-        </w:numPr>
-        <w:spacing w:after="20"/>
-      </w:pPr>
-      <w:r>
-        <w:t xml:space="preserve">Directed 2 developers across the document platform and a Mortgage Bridge CRM, owning code review and release gating; built the CRM's first version before onboarding them</w:t>
+        <w:t xml:space="preserve">Led end-to-end build of an AI-powered, multi-tenant document-collection SaaS (Next.js, React, TypeScript, Supabase/PostgreSQL), with 3 client firms confirmed and queued for onboarding ahead of launch</w:t>
+      </w:r>
+    </w:p>
+    <w:p>
+      <w:pPr>
+        <w:pStyle w:val="ListParagraph"/>
+        <w:numPr>
+          <w:ilvl w:val="0"/>
+          <w:numId w:val="1"/>
+        </w:numPr>
+        <w:spacing w:after="20"/>
+      </w:pPr>
+      <w:r>
+        <w:t xml:space="preserve">Built an AI-assisted engineering workflow (Claude Code + Codex) that gates every AI-generated change behind an independent adversarial review before production, reducing feature delivery time by at least 60%</w:t>
+      </w:r>
+    </w:p>
+    <w:p>
+      <w:pPr>
+        <w:pStyle w:val="ListParagraph"/>
+        <w:numPr>
+          <w:ilvl w:val="0"/>
+          <w:numId w:val="1"/>
+        </w:numPr>
+        <w:spacing w:after="20"/>
+      </w:pPr>
+      <w:r>
+        <w:t xml:space="preserve">Built the full stack (database schema, per-tenant row-level security, backend, front end and an AI-driven document-verification pipeline), enforcing strict data isolation across every client firm</w:t>
+      </w:r>
+    </w:p>
+    <w:p>
+      <w:pPr>
+        <w:pStyle w:val="ListParagraph"/>
+        <w:numPr>
+          <w:ilvl w:val="0"/>
+          <w:numId w:val="1"/>
+        </w:numPr>
+        <w:spacing w:after="20"/>
+      </w:pPr>
+      <w:r>
+        <w:t xml:space="preserve">Directed 2 developers across the document platform and the Mortgage Bridge CRM, owning code review and release gating</w:t>
       </w:r>
     </w:p>
     <w:tbl>
@@ -575,7 +562,7 @@
         <w:spacing w:after="20"/>
       </w:pPr>
       <w:r>
-        <w:t xml:space="preserve">Built 15 reusable, templated prompt systems, each powering a separate client customer-service chatbot and optimised for consistent AI parsing</w:t>
+        <w:t xml:space="preserve">Built 15 reusable, templated prompt systems, each powering a separate client customer-service chatbot with a standardised structure for consistent behaviour</w:t>
       </w:r>
     </w:p>
     <w:tbl>
@@ -679,7 +666,7 @@
         <w:spacing w:after="20"/>
       </w:pPr>
       <w:r>
-        <w:t xml:space="preserve">Engineered an Android chatbot UI in Kotlin (Android Studio) for a client deployment (Three), styled as an SMS-style conversation with voice input</w:t>
+        <w:t xml:space="preserve">Built an Android chatbot UI in Kotlin (Android Studio) for a client deployment (Three), styled as an SMS-style conversation with voice input, delivered as a working prototype for client review</w:t>
       </w:r>
     </w:p>
     <w:p>
@@ -711,94 +698,46 @@
         <w:spacing w:after="20"/>
       </w:pPr>
       <w:r>
-        <w:rPr>
-          <w:b/>
-          <w:bCs/>
-        </w:rPr>
-        <w:t xml:space="preserve">Mortgage Bridge CRM: </w:t>
-      </w:r>
-      <w:r>
-        <w:t xml:space="preserve">mobile-first installable PWA over GoHighLevel; Node backend, PostgreSQL, scrypt-hashed sessions, role-based access and web-push notifications</w:t>
-      </w:r>
-    </w:p>
-    <w:p>
-      <w:pPr>
-        <w:pStyle w:val="ListParagraph"/>
-        <w:numPr>
-          <w:ilvl w:val="0"/>
-          <w:numId w:val="1"/>
-        </w:numPr>
-        <w:spacing w:after="20"/>
-      </w:pPr>
-      <w:r>
-        <w:rPr>
-          <w:b/>
-          <w:bCs/>
-        </w:rPr>
-        <w:t xml:space="preserve">Regulated Site Launch: </w:t>
-      </w:r>
-      <w:r>
-        <w:t xml:space="preserve">took an FCA-regulated brokerage live; hardened with security headers (HSTS, CSP) and performed a zero-downtime DNS cutover</w:t>
-      </w:r>
-    </w:p>
-    <w:p>
-      <w:pPr>
-        <w:pStyle w:val="ListParagraph"/>
-        <w:numPr>
-          <w:ilvl w:val="0"/>
-          <w:numId w:val="1"/>
-        </w:numPr>
-        <w:spacing w:after="20"/>
-      </w:pPr>
-      <w:r>
-        <w:rPr>
-          <w:b/>
-          <w:bCs/>
-        </w:rPr>
-        <w:t xml:space="preserve">Legacy System Recovery: </w:t>
-      </w:r>
-      <w:r>
-        <w:t xml:space="preserve">recovered a decommissioned 18-month-old .NET application with no source repository, reconstructing its logic and data model from build artefacts and migration history</w:t>
-      </w:r>
-    </w:p>
-    <w:p>
-      <w:pPr>
-        <w:pStyle w:val="ListParagraph"/>
-        <w:numPr>
-          <w:ilvl w:val="0"/>
-          <w:numId w:val="1"/>
-        </w:numPr>
-        <w:spacing w:after="20"/>
-      </w:pPr>
-      <w:r>
-        <w:rPr>
-          <w:b/>
-          <w:bCs/>
-        </w:rPr>
-        <w:t xml:space="preserve">Hackathon Builds: </w:t>
-      </w:r>
-      <w:r>
-        <w:t xml:space="preserve">real-time speech and text translator (runner-up) and a photo-to-music app via the Spotify API</w:t>
-      </w:r>
-    </w:p>
-    <w:p>
-      <w:pPr>
-        <w:pStyle w:val="ListParagraph"/>
-        <w:numPr>
-          <w:ilvl w:val="0"/>
-          <w:numId w:val="1"/>
-        </w:numPr>
-        <w:spacing w:after="20"/>
-      </w:pPr>
-      <w:r>
-        <w:rPr>
-          <w:b/>
-          <w:bCs/>
-        </w:rPr>
-        <w:t xml:space="preserve">NEA Stealth Game: </w:t>
-      </w:r>
-      <w:r>
-        <w:t xml:space="preserve">2D stealth game built solo in Godot (GDScript); all code, art and level design from scratch</w:t>
+        <w:t xml:space="preserve">Built Mortgage Bridge CRM, a mobile-first installable PWA giving brokers a secure mobile workflow over their GoHighLevel CRM (Node, PostgreSQL, scrypt-hashed sessions, role-based access, web-push); built the first version and now lead its development</w:t>
+      </w:r>
+    </w:p>
+    <w:p>
+      <w:pPr>
+        <w:pStyle w:val="ListParagraph"/>
+        <w:numPr>
+          <w:ilvl w:val="0"/>
+          <w:numId w:val="1"/>
+        </w:numPr>
+        <w:spacing w:after="20"/>
+      </w:pPr>
+      <w:r>
+        <w:t xml:space="preserve">Launched and hardened an FCA-regulated brokerage website with security headers (HSTS, CSP) and a zero-downtime DNS cutover over the client's live email</w:t>
+      </w:r>
+    </w:p>
+    <w:p>
+      <w:pPr>
+        <w:pStyle w:val="ListParagraph"/>
+        <w:numPr>
+          <w:ilvl w:val="0"/>
+          <w:numId w:val="1"/>
+        </w:numPr>
+        <w:spacing w:after="20"/>
+      </w:pPr>
+      <w:r>
+        <w:t xml:space="preserve">Recovered a decommissioned 18-month-old .NET application with no source repository, reconstructing its logic and data model from build artefacts and migration history</w:t>
+      </w:r>
+    </w:p>
+    <w:p>
+      <w:pPr>
+        <w:pStyle w:val="ListParagraph"/>
+        <w:numPr>
+          <w:ilvl w:val="0"/>
+          <w:numId w:val="1"/>
+        </w:numPr>
+        <w:spacing w:after="20"/>
+      </w:pPr>
+      <w:r>
+        <w:t xml:space="preserve">Built a real-time speech and text translator, taking runner-up at the Builder Club hackathon against 10+ teams, and a photo-to-music app using the Spotify API</w:t>
       </w:r>
     </w:p>
     <w:p>
@@ -817,7 +756,7 @@
           <w:sz w:val="24"/>
           <w:szCs w:val="24"/>
         </w:rPr>
-        <w:t xml:space="preserve">Skills &amp; Interests</w:t>
+        <w:t xml:space="preserve">Additional Information</w:t>
       </w:r>
     </w:p>
     <w:tbl>
@@ -853,7 +792,7 @@
                 <w:i/>
                 <w:iCs/>
               </w:rPr>
-              <w:t xml:space="preserve">Technical:</w:t>
+              <w:t xml:space="preserve">Languages:</w:t>
             </w:r>
           </w:p>
         </w:tc>
@@ -869,7 +808,7 @@
           </w:tcPr>
           <w:p>
             <w:r>
-              <w:t xml:space="preserve">TypeScript, JavaScript, Python, SQL, C++, C, Java, Kotlin; React, Next.js, Node.js; PostgreSQL, Supabase, Git; row-level security, REST/webhooks, web security (CSP/headers), automated testing</w:t>
+              <w:t xml:space="preserve">English (Native)</w:t>
             </w:r>
           </w:p>
         </w:tc>
@@ -891,7 +830,7 @@
                 <w:i/>
                 <w:iCs/>
               </w:rPr>
-              <w:t xml:space="preserve">Languages:</w:t>
+              <w:t xml:space="preserve">Technical:</w:t>
             </w:r>
           </w:p>
         </w:tc>
@@ -907,7 +846,7 @@
           </w:tcPr>
           <w:p>
             <w:r>
-              <w:t xml:space="preserve">English (Native)</w:t>
+              <w:t xml:space="preserve">TypeScript, JavaScript, Python, SQL, C++, C, Java, Kotlin, HTML/CSS; React, Next.js, Node.js; PostgreSQL, Supabase, Git</w:t>
             </w:r>
           </w:p>
         </w:tc>
@@ -945,7 +884,7 @@
           </w:tcPr>
           <w:p>
             <w:r>
-              <w:t xml:space="preserve">Guitar &amp; piano, gaming, hiking, learning Italian (Duolingo)</w:t>
+              <w:t xml:space="preserve">Grade 7 guitar and self-taught piano; single-player RPGs (a dedicated completionist); learning Italian</w:t>
             </w:r>
           </w:p>
         </w:tc>

</xml_diff>

<commit_message>
Polish CV: black header links, de-duped bullet, real 1,344-lead metric, Italian to Languages
Co-Authored-By: Claude Opus 4.8 <noreply@anthropic.com>
</commit_message>
<xml_diff>
--- a/src/assests/documents/Daniel_Baylan_CV.docx
+++ b/src/assests/documents/Daniel_Baylan_CV.docx
@@ -26,10 +26,10 @@
       <w:r>
         <w:t xml:space="preserve">DanielJBaylan@gmail.com  |  +44 7703144054  |  </w:t>
       </w:r>
-      <w:hyperlink w:history="1" r:id="rIdkeoltmxez7b_nni1q3ayh">
+      <w:hyperlink w:history="1" r:id="rIduzc2cdq_-qxtfs0ue6q3f">
         <w:r>
           <w:rPr>
-            <w:rStyle w:val="Hyperlink"/>
+            <w:color w:val="000000"/>
           </w:rPr>
           <w:t xml:space="preserve">LinkedIn</w:t>
         </w:r>
@@ -37,10 +37,10 @@
       <w:r>
         <w:t xml:space="preserve">  |  </w:t>
       </w:r>
-      <w:hyperlink w:history="1" r:id="rIdmmfg2rbzk_eykmztgdwqz">
+      <w:hyperlink w:history="1" r:id="rIdjrdxzdil05zesqnr_i271">
         <w:r>
           <w:rPr>
-            <w:rStyle w:val="Hyperlink"/>
+            <w:color w:val="000000"/>
           </w:rPr>
           <w:t xml:space="preserve">Portfolio</w:t>
         </w:r>
@@ -445,7 +445,7 @@
         <w:spacing w:after="20"/>
       </w:pPr>
       <w:r>
-        <w:t xml:space="preserve">Built the full stack (database schema, per-tenant row-level security, backend, front end and an AI-driven document-verification pipeline), enforcing strict data isolation across every client firm</w:t>
+        <w:t xml:space="preserve">Designed the data model and per-tenant row-level security enforcing strict data isolation across every client firm, plus an AI-driven pipeline that verifies incoming customer documents</w:t>
       </w:r>
     </w:p>
     <w:p>
@@ -698,7 +698,7 @@
         <w:spacing w:after="20"/>
       </w:pPr>
       <w:r>
-        <w:t xml:space="preserve">Built Mortgage Bridge CRM, a mobile-first installable PWA giving brokers a secure mobile workflow over their GoHighLevel CRM (Node, PostgreSQL, scrypt-hashed sessions, role-based access, web-push); built the first version and now lead its development</w:t>
+        <w:t xml:space="preserve">Built Mortgage Bridge CRM, a mobile-first installable PWA giving brokers a faster, secure workflow over a 1,344-lead pipeline, replacing a GoHighLevel setup with a standalone PostgreSQL database and improved UI (Node, scrypt-hashed sessions, role-based access, web-push); built the first version and now lead its development</w:t>
       </w:r>
     </w:p>
     <w:p>
@@ -724,20 +724,20 @@
         <w:spacing w:after="20"/>
       </w:pPr>
       <w:r>
-        <w:t xml:space="preserve">Recovered a decommissioned 18-month-old .NET application with no source repository, reconstructing its logic and data model from build artefacts and migration history</w:t>
-      </w:r>
-    </w:p>
-    <w:p>
-      <w:pPr>
-        <w:pStyle w:val="ListParagraph"/>
-        <w:numPr>
-          <w:ilvl w:val="0"/>
-          <w:numId w:val="1"/>
-        </w:numPr>
-        <w:spacing w:after="20"/>
-      </w:pPr>
-      <w:r>
-        <w:t xml:space="preserve">Built a real-time speech and text translator, taking runner-up at the Builder Club hackathon against 10+ teams, and a photo-to-music app using the Spotify API</w:t>
+        <w:t xml:space="preserve">Recovered a decommissioned 18-month-old .NET application with no source repository, reconstructing its logic and data model from build artefacts and migration history to guide the design of its replacement system</w:t>
+      </w:r>
+    </w:p>
+    <w:p>
+      <w:pPr>
+        <w:pStyle w:val="ListParagraph"/>
+        <w:numPr>
+          <w:ilvl w:val="0"/>
+          <w:numId w:val="1"/>
+        </w:numPr>
+        <w:spacing w:after="20"/>
+      </w:pPr>
+      <w:r>
+        <w:t xml:space="preserve">Took runner-up at the Builder Club hackathon (against 10+ teams), building a real-time speech and text translator</w:t>
       </w:r>
     </w:p>
     <w:p>
@@ -808,7 +808,7 @@
           </w:tcPr>
           <w:p>
             <w:r>
-              <w:t xml:space="preserve">English (Native)</w:t>
+              <w:t xml:space="preserve">English (Native); Italian (Basic)</w:t>
             </w:r>
           </w:p>
         </w:tc>
@@ -884,7 +884,7 @@
           </w:tcPr>
           <w:p>
             <w:r>
-              <w:t xml:space="preserve">Grade 7 guitar and self-taught piano; single-player RPGs (a dedicated completionist); learning Italian</w:t>
+              <w:t xml:space="preserve">Grade 7 guitar and self-taught piano; single-player RPGs (a dedicated completionist)</w:t>
             </w:r>
           </w:p>
         </w:tc>

</xml_diff>